<commit_message>
docs(kqnodes): documenta cobertura experimental y límites de hardware (Anexo D)
Agrega un "Anexo D" a los manuales técnico y de usuario de KQNodes (.md y .docx)
explicando por qué no se ejecutaron todos los casos de DatosPruebas2026_1.xlsx.

Contenido documentado:
- Causa raíz: costo exponencial 2^N, con tabla de tamaños reales de la TPM
  (10→21 KB, 20→273 MB, 22→1.2 GB, 25→10.9 GB).
- Límite de memoria: equipo AMD 3020e (~6 GB RAM, ~1.7 GB libres); MemoryError en
  N=22 y su mitigación (carga con pandas float32 + 1 worker); N=25 inviable.
- Límite de tiempo: timeout de 1 h por caso.
- Cobertura real por hoja: 10/15/20 completos, 22 parcial, 25 sin ejecutar.
- Cómo completar lo pendiente (más RAM/núcleos; reintento automático de TIMEOUT).

Los .docx se editaron con scripts/append_anexo_d.py (idempotente) en vez de
regenerarlos, para preservar las imágenes insertadas y el enlace del video.
</commit_message>
<xml_diff>
--- a/KQNodes/docs/Manual_Tecnico_KQNodes.docx
+++ b/KQNodes/docs/Manual_Tecnico_KQNodes.docx
@@ -22347,6 +22347,717 @@
       </w:r>
       <w:bookmarkEnd w:id="88"/>
       <w:bookmarkEnd w:id="104"/>
+    </w:p>
+    <w:p>
+      <w:pPr>
+        <w:pStyle w:val="Ttulo2"/>
+      </w:pPr>
+      <w:r>
+        <w:t>Anexo D — Cobertura experimental y limitaciones de hardware</w:t>
+      </w:r>
+    </w:p>
+    <w:p>
+      <w:r>
+        <w:t>El conjunto de pruebas de docs/DatosPruebas2026_1.xlsx incluye redes de 10, 15, 20, 22 y 25 elementos. No todos los casos pudieron ejecutarse en el equipo de desarrollo por límites de memoria y tiempo. Esta sección documenta la causa, las mitigaciones aplicadas y la cobertura realmente alcanzada.</w:t>
+      </w:r>
+    </w:p>
+    <w:p>
+      <w:pPr>
+        <w:pStyle w:val="Ttulo3"/>
+      </w:pPr>
+      <w:r>
+        <w:t>D.1 Causa raíz — costo exponencial en N</w:t>
+      </w:r>
+    </w:p>
+    <w:p>
+      <w:r>
+        <w:t>El problema es intrínsecamente exponencial: un sistema de N nodos tiene 2^N estados, por lo que la TPM tiene 2^N filas × N columnas. Cada elemento adicional duplica (como mínimo) la memoria y el tiempo necesarios. Esto se refleja en el tamaño de los archivos de muestra (CSV de la TPM):</w:t>
+      </w:r>
+    </w:p>
+    <w:tbl>
+      <w:tblPr>
+        <w:tblStyle w:val="Table"/>
+        <w:tblW w:type="auto" w:w="0"/>
+        <w:tblLook w:firstColumn="1" w:firstRow="1" w:lastColumn="0" w:lastRow="0" w:noHBand="0" w:noVBand="1" w:val="04A0"/>
+      </w:tblPr>
+      <w:tblGrid>
+        <w:gridCol w:w="2946"/>
+        <w:gridCol w:w="2946"/>
+        <w:gridCol w:w="2946"/>
+      </w:tblGrid>
+      <w:tr>
+        <w:tc>
+          <w:tcPr>
+            <w:tcW w:type="dxa" w:w="2946"/>
+          </w:tcPr>
+          <w:p>
+            <w:r>
+              <w:rPr>
+                <w:b/>
+              </w:rPr>
+              <w:t>N</w:t>
+            </w:r>
+          </w:p>
+        </w:tc>
+        <w:tc>
+          <w:tcPr>
+            <w:tcW w:type="dxa" w:w="2946"/>
+          </w:tcPr>
+          <w:p>
+            <w:r>
+              <w:rPr>
+                <w:b/>
+              </w:rPr>
+              <w:t>Estados (2^N)</w:t>
+            </w:r>
+          </w:p>
+        </w:tc>
+        <w:tc>
+          <w:tcPr>
+            <w:tcW w:type="dxa" w:w="2946"/>
+          </w:tcPr>
+          <w:p>
+            <w:r>
+              <w:rPr>
+                <w:b/>
+              </w:rPr>
+              <w:t>Tamaño TPM (CSV)</w:t>
+            </w:r>
+          </w:p>
+        </w:tc>
+      </w:tr>
+      <w:tr>
+        <w:tc>
+          <w:tcPr>
+            <w:tcW w:type="dxa" w:w="2946"/>
+          </w:tcPr>
+          <w:p>
+            <w:r>
+              <w:t>10</w:t>
+            </w:r>
+          </w:p>
+        </w:tc>
+        <w:tc>
+          <w:tcPr>
+            <w:tcW w:type="dxa" w:w="2946"/>
+          </w:tcPr>
+          <w:p>
+            <w:r>
+              <w:t>1 024</w:t>
+            </w:r>
+          </w:p>
+        </w:tc>
+        <w:tc>
+          <w:tcPr>
+            <w:tcW w:type="dxa" w:w="2946"/>
+          </w:tcPr>
+          <w:p>
+            <w:r>
+              <w:t>~21 KB</w:t>
+            </w:r>
+          </w:p>
+        </w:tc>
+      </w:tr>
+      <w:tr>
+        <w:tc>
+          <w:tcPr>
+            <w:tcW w:type="dxa" w:w="2946"/>
+          </w:tcPr>
+          <w:p>
+            <w:r>
+              <w:t>15</w:t>
+            </w:r>
+          </w:p>
+        </w:tc>
+        <w:tc>
+          <w:tcPr>
+            <w:tcW w:type="dxa" w:w="2946"/>
+          </w:tcPr>
+          <w:p>
+            <w:r>
+              <w:t>32 768</w:t>
+            </w:r>
+          </w:p>
+        </w:tc>
+        <w:tc>
+          <w:tcPr>
+            <w:tcW w:type="dxa" w:w="2946"/>
+          </w:tcPr>
+          <w:p>
+            <w:r>
+              <w:t>~5 MB</w:t>
+            </w:r>
+          </w:p>
+        </w:tc>
+      </w:tr>
+      <w:tr>
+        <w:tc>
+          <w:tcPr>
+            <w:tcW w:type="dxa" w:w="2946"/>
+          </w:tcPr>
+          <w:p>
+            <w:r>
+              <w:t>20</w:t>
+            </w:r>
+          </w:p>
+        </w:tc>
+        <w:tc>
+          <w:tcPr>
+            <w:tcW w:type="dxa" w:w="2946"/>
+          </w:tcPr>
+          <w:p>
+            <w:r>
+              <w:t>1 048 576</w:t>
+            </w:r>
+          </w:p>
+        </w:tc>
+        <w:tc>
+          <w:tcPr>
+            <w:tcW w:type="dxa" w:w="2946"/>
+          </w:tcPr>
+          <w:p>
+            <w:r>
+              <w:t>~273 MB</w:t>
+            </w:r>
+          </w:p>
+        </w:tc>
+      </w:tr>
+      <w:tr>
+        <w:tc>
+          <w:tcPr>
+            <w:tcW w:type="dxa" w:w="2946"/>
+          </w:tcPr>
+          <w:p>
+            <w:r>
+              <w:t>22</w:t>
+            </w:r>
+          </w:p>
+        </w:tc>
+        <w:tc>
+          <w:tcPr>
+            <w:tcW w:type="dxa" w:w="2946"/>
+          </w:tcPr>
+          <w:p>
+            <w:r>
+              <w:t>4 194 304</w:t>
+            </w:r>
+          </w:p>
+        </w:tc>
+        <w:tc>
+          <w:tcPr>
+            <w:tcW w:type="dxa" w:w="2946"/>
+          </w:tcPr>
+          <w:p>
+            <w:r>
+              <w:t>~1.2 GB</w:t>
+            </w:r>
+          </w:p>
+        </w:tc>
+      </w:tr>
+      <w:tr>
+        <w:tc>
+          <w:tcPr>
+            <w:tcW w:type="dxa" w:w="2946"/>
+          </w:tcPr>
+          <w:p>
+            <w:r>
+              <w:t>25</w:t>
+            </w:r>
+          </w:p>
+        </w:tc>
+        <w:tc>
+          <w:tcPr>
+            <w:tcW w:type="dxa" w:w="2946"/>
+          </w:tcPr>
+          <w:p>
+            <w:r>
+              <w:t>33 554 432</w:t>
+            </w:r>
+          </w:p>
+        </w:tc>
+        <w:tc>
+          <w:tcPr>
+            <w:tcW w:type="dxa" w:w="2946"/>
+          </w:tcPr>
+          <w:p>
+            <w:r>
+              <w:t>~10.9 GB</w:t>
+            </w:r>
+          </w:p>
+        </w:tc>
+      </w:tr>
+    </w:tbl>
+    <w:p>
+      <w:pPr>
+        <w:pStyle w:val="Ttulo3"/>
+      </w:pPr>
+      <w:r>
+        <w:t>D.2 Límite de memoria (RAM)</w:t>
+      </w:r>
+    </w:p>
+    <w:p>
+      <w:r>
+        <w:t>Equipo de referencia: AMD 3020e (2 núcleos físicos a 1.2 GHz), RAM física limitada (~6 GB, con ~1.7 GB libres durante la ejecución).</w:t>
+      </w:r>
+    </w:p>
+    <w:p>
+      <w:r>
+        <w:t>• Cargar la TPM de N=22 con el método original (np.genfromtxt en sia_cargar_tpm) provocaba MemoryError: ese parser construye listas de Python y su pico de RAM es ~5–10× el tamaño del archivo (&gt;6 GB para 1.2 GB de CSV).</w:t>
+      </w:r>
+    </w:p>
+    <w:p>
+      <w:r>
+        <w:t>• Mitigación aplicada (scripts/fill_excel_geomip.py): se reemplazó la carga por pandas.read_csv(..., dtype=np.float32) (parser en C, pico bajo). float32 es numéricamente idéntico a lo que System ya hace internamente. Además se limita a 1 worker para N≥22, evitando dos copias simultáneas de la TPM en memoria.</w:t>
+      </w:r>
+    </w:p>
+    <w:p>
+      <w:r>
+        <w:t>• Con esto N=22 deja de fallar por memoria, pero N=25 sigue siendo inviable en este hardware: solo el arreglo final en float32 ocupa 2^25 × 25 × 4 bytes ≈ 3.3 GB, que ya excede la RAM libre, sin contar los n-cubos derivados ni el sistema operativo.</w:t>
+      </w:r>
+    </w:p>
+    <w:p>
+      <w:pPr>
+        <w:pStyle w:val="Ttulo3"/>
+      </w:pPr>
+      <w:r>
+        <w:t>D.3 Límite de tiempo</w:t>
+      </w:r>
+    </w:p>
+    <w:p>
+      <w:r>
+        <w:t>Cada caso se ejecuta con un timeout de 1 hora (MAX_TIME_SEG = 3600 s). Si se supera, el script escribe TIMEOUT en la celda y continúa con el siguiente caso (las celdas en TIMEOUT se reintentan en corridas posteriores). Para N grande, un único caso puede acercarse o superar ese límite, de modo que completar las ~50 pruebas de una hoja tomaría días en este equipo.</w:t>
+      </w:r>
+    </w:p>
+    <w:p>
+      <w:pPr>
+        <w:pStyle w:val="Ttulo3"/>
+      </w:pPr>
+      <w:r>
+        <w:t>D.4 Cobertura realmente alcanzada</w:t>
+      </w:r>
+    </w:p>
+    <w:tbl>
+      <w:tblPr>
+        <w:tblStyle w:val="Table"/>
+        <w:tblW w:type="auto" w:w="0"/>
+        <w:tblLook w:firstColumn="1" w:firstRow="1" w:lastColumn="0" w:lastRow="0" w:noHBand="0" w:noVBand="1" w:val="04A0"/>
+      </w:tblPr>
+      <w:tblGrid>
+        <w:gridCol w:w="1473"/>
+        <w:gridCol w:w="1473"/>
+        <w:gridCol w:w="1473"/>
+        <w:gridCol w:w="1473"/>
+        <w:gridCol w:w="1473"/>
+        <w:gridCol w:w="1473"/>
+      </w:tblGrid>
+      <w:tr>
+        <w:tc>
+          <w:tcPr>
+            <w:tcW w:type="dxa" w:w="1473"/>
+          </w:tcPr>
+          <w:p>
+            <w:r>
+              <w:rPr>
+                <w:b/>
+              </w:rPr>
+              <w:t>Hoja</w:t>
+            </w:r>
+          </w:p>
+        </w:tc>
+        <w:tc>
+          <w:tcPr>
+            <w:tcW w:type="dxa" w:w="1473"/>
+          </w:tcPr>
+          <w:p>
+            <w:r>
+              <w:rPr>
+                <w:b/>
+              </w:rPr>
+              <w:t>N</w:t>
+            </w:r>
+          </w:p>
+        </w:tc>
+        <w:tc>
+          <w:tcPr>
+            <w:tcW w:type="dxa" w:w="1473"/>
+          </w:tcPr>
+          <w:p>
+            <w:r>
+              <w:rPr>
+                <w:b/>
+              </w:rPr>
+              <w:t>k=2 QNodes</w:t>
+            </w:r>
+          </w:p>
+        </w:tc>
+        <w:tc>
+          <w:tcPr>
+            <w:tcW w:type="dxa" w:w="1473"/>
+          </w:tcPr>
+          <w:p>
+            <w:r>
+              <w:rPr>
+                <w:b/>
+              </w:rPr>
+              <w:t>k=2 Geometric</w:t>
+            </w:r>
+          </w:p>
+        </w:tc>
+        <w:tc>
+          <w:tcPr>
+            <w:tcW w:type="dxa" w:w="1473"/>
+          </w:tcPr>
+          <w:p>
+            <w:r>
+              <w:rPr>
+                <w:b/>
+              </w:rPr>
+              <w:t>k=3 / k=4 / k=5</w:t>
+            </w:r>
+          </w:p>
+        </w:tc>
+        <w:tc>
+          <w:tcPr>
+            <w:tcW w:type="dxa" w:w="1473"/>
+          </w:tcPr>
+          <w:p>
+            <w:r>
+              <w:rPr>
+                <w:b/>
+              </w:rPr>
+              <w:t>Estado</w:t>
+            </w:r>
+          </w:p>
+        </w:tc>
+      </w:tr>
+      <w:tr>
+        <w:tc>
+          <w:tcPr>
+            <w:tcW w:type="dxa" w:w="1473"/>
+          </w:tcPr>
+          <w:p>
+            <w:r>
+              <w:t>10A</w:t>
+            </w:r>
+          </w:p>
+        </w:tc>
+        <w:tc>
+          <w:tcPr>
+            <w:tcW w:type="dxa" w:w="1473"/>
+          </w:tcPr>
+          <w:p>
+            <w:r>
+              <w:t>10</w:t>
+            </w:r>
+          </w:p>
+        </w:tc>
+        <w:tc>
+          <w:tcPr>
+            <w:tcW w:type="dxa" w:w="1473"/>
+          </w:tcPr>
+          <w:p>
+            <w:r>
+              <w:t>49/49</w:t>
+            </w:r>
+          </w:p>
+        </w:tc>
+        <w:tc>
+          <w:tcPr>
+            <w:tcW w:type="dxa" w:w="1473"/>
+          </w:tcPr>
+          <w:p>
+            <w:r>
+              <w:t>49/49</w:t>
+            </w:r>
+          </w:p>
+        </w:tc>
+        <w:tc>
+          <w:tcPr>
+            <w:tcW w:type="dxa" w:w="1473"/>
+          </w:tcPr>
+          <w:p>
+            <w:r>
+              <w:t>49 / 49 / 49</w:t>
+            </w:r>
+          </w:p>
+        </w:tc>
+        <w:tc>
+          <w:tcPr>
+            <w:tcW w:type="dxa" w:w="1473"/>
+          </w:tcPr>
+          <w:p>
+            <w:r>
+              <w:t>Completo</w:t>
+            </w:r>
+          </w:p>
+        </w:tc>
+      </w:tr>
+      <w:tr>
+        <w:tc>
+          <w:tcPr>
+            <w:tcW w:type="dxa" w:w="1473"/>
+          </w:tcPr>
+          <w:p>
+            <w:r>
+              <w:t>15B</w:t>
+            </w:r>
+          </w:p>
+        </w:tc>
+        <w:tc>
+          <w:tcPr>
+            <w:tcW w:type="dxa" w:w="1473"/>
+          </w:tcPr>
+          <w:p>
+            <w:r>
+              <w:t>15</w:t>
+            </w:r>
+          </w:p>
+        </w:tc>
+        <w:tc>
+          <w:tcPr>
+            <w:tcW w:type="dxa" w:w="1473"/>
+          </w:tcPr>
+          <w:p>
+            <w:r>
+              <w:t>50/50</w:t>
+            </w:r>
+          </w:p>
+        </w:tc>
+        <w:tc>
+          <w:tcPr>
+            <w:tcW w:type="dxa" w:w="1473"/>
+          </w:tcPr>
+          <w:p>
+            <w:r>
+              <w:t>50/50</w:t>
+            </w:r>
+          </w:p>
+        </w:tc>
+        <w:tc>
+          <w:tcPr>
+            <w:tcW w:type="dxa" w:w="1473"/>
+          </w:tcPr>
+          <w:p>
+            <w:r>
+              <w:t>50 / 50 / 50</w:t>
+            </w:r>
+          </w:p>
+        </w:tc>
+        <w:tc>
+          <w:tcPr>
+            <w:tcW w:type="dxa" w:w="1473"/>
+          </w:tcPr>
+          <w:p>
+            <w:r>
+              <w:t>Completo</w:t>
+            </w:r>
+          </w:p>
+        </w:tc>
+      </w:tr>
+      <w:tr>
+        <w:tc>
+          <w:tcPr>
+            <w:tcW w:type="dxa" w:w="1473"/>
+          </w:tcPr>
+          <w:p>
+            <w:r>
+              <w:t>20A</w:t>
+            </w:r>
+          </w:p>
+        </w:tc>
+        <w:tc>
+          <w:tcPr>
+            <w:tcW w:type="dxa" w:w="1473"/>
+          </w:tcPr>
+          <w:p>
+            <w:r>
+              <w:t>20</w:t>
+            </w:r>
+          </w:p>
+        </w:tc>
+        <w:tc>
+          <w:tcPr>
+            <w:tcW w:type="dxa" w:w="1473"/>
+          </w:tcPr>
+          <w:p>
+            <w:r>
+              <w:t>50/50</w:t>
+            </w:r>
+          </w:p>
+        </w:tc>
+        <w:tc>
+          <w:tcPr>
+            <w:tcW w:type="dxa" w:w="1473"/>
+          </w:tcPr>
+          <w:p>
+            <w:r>
+              <w:t>50/50</w:t>
+            </w:r>
+          </w:p>
+        </w:tc>
+        <w:tc>
+          <w:tcPr>
+            <w:tcW w:type="dxa" w:w="1473"/>
+          </w:tcPr>
+          <w:p>
+            <w:r>
+              <w:t>50 / 49 (1 timeout) / 50</w:t>
+            </w:r>
+          </w:p>
+        </w:tc>
+        <w:tc>
+          <w:tcPr>
+            <w:tcW w:type="dxa" w:w="1473"/>
+          </w:tcPr>
+          <w:p>
+            <w:r>
+              <w:t>Prácticamente completo</w:t>
+            </w:r>
+          </w:p>
+        </w:tc>
+      </w:tr>
+      <w:tr>
+        <w:tc>
+          <w:tcPr>
+            <w:tcW w:type="dxa" w:w="1473"/>
+          </w:tcPr>
+          <w:p>
+            <w:r>
+              <w:t>22A</w:t>
+            </w:r>
+          </w:p>
+        </w:tc>
+        <w:tc>
+          <w:tcPr>
+            <w:tcW w:type="dxa" w:w="1473"/>
+          </w:tcPr>
+          <w:p>
+            <w:r>
+              <w:t>22</w:t>
+            </w:r>
+          </w:p>
+        </w:tc>
+        <w:tc>
+          <w:tcPr>
+            <w:tcW w:type="dxa" w:w="1473"/>
+          </w:tcPr>
+          <w:p>
+            <w:r>
+              <w:t>32/50</w:t>
+            </w:r>
+          </w:p>
+        </w:tc>
+        <w:tc>
+          <w:tcPr>
+            <w:tcW w:type="dxa" w:w="1473"/>
+          </w:tcPr>
+          <w:p>
+            <w:r>
+              <w:t>50/50</w:t>
+            </w:r>
+          </w:p>
+        </w:tc>
+        <w:tc>
+          <w:tcPr>
+            <w:tcW w:type="dxa" w:w="1473"/>
+          </w:tcPr>
+          <w:p>
+            <w:r>
+              <w:t>0 / 0 / 0</w:t>
+            </w:r>
+          </w:p>
+        </w:tc>
+        <w:tc>
+          <w:tcPr>
+            <w:tcW w:type="dxa" w:w="1473"/>
+          </w:tcPr>
+          <w:p>
+            <w:r>
+              <w:t>Parcial</w:t>
+            </w:r>
+          </w:p>
+        </w:tc>
+      </w:tr>
+      <w:tr>
+        <w:tc>
+          <w:tcPr>
+            <w:tcW w:type="dxa" w:w="1473"/>
+          </w:tcPr>
+          <w:p>
+            <w:r>
+              <w:t>25A</w:t>
+            </w:r>
+          </w:p>
+        </w:tc>
+        <w:tc>
+          <w:tcPr>
+            <w:tcW w:type="dxa" w:w="1473"/>
+          </w:tcPr>
+          <w:p>
+            <w:r>
+              <w:t>25</w:t>
+            </w:r>
+          </w:p>
+        </w:tc>
+        <w:tc>
+          <w:tcPr>
+            <w:tcW w:type="dxa" w:w="1473"/>
+          </w:tcPr>
+          <w:p>
+            <w:r>
+              <w:t>0/50</w:t>
+            </w:r>
+          </w:p>
+        </w:tc>
+        <w:tc>
+          <w:tcPr>
+            <w:tcW w:type="dxa" w:w="1473"/>
+          </w:tcPr>
+          <w:p>
+            <w:r>
+              <w:t>0/50</w:t>
+            </w:r>
+          </w:p>
+        </w:tc>
+        <w:tc>
+          <w:tcPr>
+            <w:tcW w:type="dxa" w:w="1473"/>
+          </w:tcPr>
+          <w:p>
+            <w:r>
+              <w:t>0 / 0 / 0</w:t>
+            </w:r>
+          </w:p>
+        </w:tc>
+        <w:tc>
+          <w:tcPr>
+            <w:tcW w:type="dxa" w:w="1473"/>
+          </w:tcPr>
+          <w:p>
+            <w:r>
+              <w:t>No ejecutado</w:t>
+            </w:r>
+          </w:p>
+        </w:tc>
+      </w:tr>
+    </w:tbl>
+    <w:p>
+      <w:pPr>
+        <w:pStyle w:val="Ttulo3"/>
+      </w:pPr>
+      <w:r>
+        <w:t>D.5 Reproducibilidad y cómo completar lo pendiente</w:t>
+      </w:r>
+    </w:p>
+    <w:p>
+      <w:r>
+        <w:t>• Los resultados de 10, 15 y 20 elementos están completos y se analizan en la hoja «Análisis 10-15-20» del Excel (tablas de φ y tiempos, comparación QNodes vs Geometric y crecimiento por k).</w:t>
+      </w:r>
+    </w:p>
+    <w:p>
+      <w:r>
+        <w:t>• Para completar 22A y 25A se requiere un equipo con más RAM (≥16–32 GB) y, preferiblemente, más núcleos; alternativamente subir el timeout y procesar por lotes. El script fill_excel_geomip.py reintenta automáticamente las celdas marcadas TIMEOUT, por lo que la corrida puede reanudarse sin perder el progreso ya escrito.</w:t>
+      </w:r>
     </w:p>
     <w:sectPr>
       <w:footnotePr>

</xml_diff>